<commit_message>
docs: add Document Control section to NDS User Guide
Add a Document Control page (metadata + revision history tables) on
page 2, after the title block and before the Contents. The heading is
styled Heading 1 but set to outline level 9 so it is excluded from the
table of contents. Tables match the guide's existing styling.

Co-Authored-By: Claude Opus 4.8 <noreply@anthropic.com>
</commit_message>
<xml_diff>
--- a/docs/NDS-User-Guide.docx
+++ b/docs/NDS-User-Guide.docx
@@ -53,6 +53,863 @@
         <w:t xml:space="preserve">A single, shared catalogue of standard network devices, their accessories, links, golden images, sites and costs — with bills of materials for pricing standard builds.</w:t>
       </w:r>
     </w:p>
+    <w:p>
+      <w:r>
+        <w:br w:type="page"/>
+      </w:r>
+    </w:p>
+    <w:p>
+      <w:pPr>
+        <w:pStyle w:val="Heading1"/>
+        <w:outlineLvl w:val="9"/>
+      </w:pPr>
+      <w:r>
+        <w:t xml:space="preserve">Document Control</w:t>
+      </w:r>
+    </w:p>
+    <w:p>
+      <w:pPr>
+        <w:spacing w:before="160" w:after="60"/>
+      </w:pPr>
+      <w:r>
+        <w:rPr>
+          <w:b/>
+          <w:bCs/>
+        </w:rPr>
+        <w:t xml:space="preserve">Document information</w:t>
+      </w:r>
+    </w:p>
+    <w:tbl>
+      <w:tblPr>
+        <w:tblW w:type="dxa" w:w="9360"/>
+        <w:tblBorders>
+          <w:top w:val="single" w:color="auto" w:sz="4"/>
+          <w:left w:val="single" w:color="auto" w:sz="4"/>
+          <w:bottom w:val="single" w:color="auto" w:sz="4"/>
+          <w:right w:val="single" w:color="auto" w:sz="4"/>
+          <w:insideH w:val="single" w:color="auto" w:sz="4"/>
+          <w:insideV w:val="single" w:color="auto" w:sz="4"/>
+        </w:tblBorders>
+      </w:tblPr>
+      <w:tblGrid>
+        <w:gridCol w:w="2600"/>
+        <w:gridCol w:w="6760"/>
+      </w:tblGrid>
+      <w:tr>
+        <w:tc>
+          <w:tcPr>
+            <w:tcW w:type="dxa" w:w="2600"/>
+            <w:tcBorders>
+              <w:top w:val="single" w:color="B7C5D4" w:sz="1"/>
+              <w:left w:val="single" w:color="B7C5D4" w:sz="1"/>
+              <w:bottom w:val="single" w:color="B7C5D4" w:sz="1"/>
+              <w:right w:val="single" w:color="B7C5D4" w:sz="1"/>
+            </w:tcBorders>
+            <w:shd w:fill="FFFFFF" w:val="clear"/>
+            <w:tcMar>
+              <w:top w:type="dxa" w:w="60"/>
+              <w:left w:type="dxa" w:w="120"/>
+              <w:bottom w:type="dxa" w:w="60"/>
+              <w:right w:type="dxa" w:w="120"/>
+            </w:tcMar>
+            <w:vAlign w:val="center"/>
+          </w:tcPr>
+          <w:p>
+            <w:pPr>
+              <w:spacing w:line="264"/>
+            </w:pPr>
+            <w:r>
+              <w:rPr>
+                <w:b/>
+                <w:bCs/>
+                <w:sz w:val="20"/>
+                <w:szCs w:val="20"/>
+              </w:rPr>
+              <w:t xml:space="preserve">Document title</w:t>
+            </w:r>
+          </w:p>
+        </w:tc>
+        <w:tc>
+          <w:tcPr>
+            <w:tcW w:type="dxa" w:w="6760"/>
+            <w:tcBorders>
+              <w:top w:val="single" w:color="B7C5D4" w:sz="1"/>
+              <w:left w:val="single" w:color="B7C5D4" w:sz="1"/>
+              <w:bottom w:val="single" w:color="B7C5D4" w:sz="1"/>
+              <w:right w:val="single" w:color="B7C5D4" w:sz="1"/>
+            </w:tcBorders>
+            <w:shd w:fill="FFFFFF" w:val="clear"/>
+            <w:tcMar>
+              <w:top w:type="dxa" w:w="60"/>
+              <w:left w:type="dxa" w:w="120"/>
+              <w:bottom w:type="dxa" w:w="60"/>
+              <w:right w:type="dxa" w:w="120"/>
+            </w:tcMar>
+            <w:vAlign w:val="center"/>
+          </w:tcPr>
+          <w:p>
+            <w:pPr>
+              <w:spacing w:line="264"/>
+            </w:pPr>
+            <w:r>
+              <w:rPr>
+                <w:sz w:val="20"/>
+                <w:szCs w:val="20"/>
+              </w:rPr>
+              <w:t xml:space="preserve">Network Device Standards — User Guide &amp; Overview</w:t>
+            </w:r>
+          </w:p>
+        </w:tc>
+      </w:tr>
+      <w:tr>
+        <w:tc>
+          <w:tcPr>
+            <w:tcW w:type="dxa" w:w="2600"/>
+            <w:tcBorders>
+              <w:top w:val="single" w:color="B7C5D4" w:sz="1"/>
+              <w:left w:val="single" w:color="B7C5D4" w:sz="1"/>
+              <w:bottom w:val="single" w:color="B7C5D4" w:sz="1"/>
+              <w:right w:val="single" w:color="B7C5D4" w:sz="1"/>
+            </w:tcBorders>
+            <w:shd w:fill="FFFFFF" w:val="clear"/>
+            <w:tcMar>
+              <w:top w:type="dxa" w:w="60"/>
+              <w:left w:type="dxa" w:w="120"/>
+              <w:bottom w:type="dxa" w:w="60"/>
+              <w:right w:type="dxa" w:w="120"/>
+            </w:tcMar>
+            <w:vAlign w:val="center"/>
+          </w:tcPr>
+          <w:p>
+            <w:pPr>
+              <w:spacing w:line="264"/>
+            </w:pPr>
+            <w:r>
+              <w:rPr>
+                <w:b/>
+                <w:bCs/>
+                <w:sz w:val="20"/>
+                <w:szCs w:val="20"/>
+              </w:rPr>
+              <w:t xml:space="preserve">Owner</w:t>
+            </w:r>
+          </w:p>
+        </w:tc>
+        <w:tc>
+          <w:tcPr>
+            <w:tcW w:type="dxa" w:w="6760"/>
+            <w:tcBorders>
+              <w:top w:val="single" w:color="B7C5D4" w:sz="1"/>
+              <w:left w:val="single" w:color="B7C5D4" w:sz="1"/>
+              <w:bottom w:val="single" w:color="B7C5D4" w:sz="1"/>
+              <w:right w:val="single" w:color="B7C5D4" w:sz="1"/>
+            </w:tcBorders>
+            <w:shd w:fill="FFFFFF" w:val="clear"/>
+            <w:tcMar>
+              <w:top w:type="dxa" w:w="60"/>
+              <w:left w:type="dxa" w:w="120"/>
+              <w:bottom w:type="dxa" w:w="60"/>
+              <w:right w:type="dxa" w:w="120"/>
+            </w:tcMar>
+            <w:vAlign w:val="center"/>
+          </w:tcPr>
+          <w:p>
+            <w:pPr>
+              <w:spacing w:line="264"/>
+            </w:pPr>
+            <w:r>
+              <w:rPr>
+                <w:sz w:val="20"/>
+                <w:szCs w:val="20"/>
+              </w:rPr>
+              <w:t xml:space="preserve">Kenneth Cruickshank</w:t>
+            </w:r>
+          </w:p>
+        </w:tc>
+      </w:tr>
+      <w:tr>
+        <w:tc>
+          <w:tcPr>
+            <w:tcW w:type="dxa" w:w="2600"/>
+            <w:tcBorders>
+              <w:top w:val="single" w:color="B7C5D4" w:sz="1"/>
+              <w:left w:val="single" w:color="B7C5D4" w:sz="1"/>
+              <w:bottom w:val="single" w:color="B7C5D4" w:sz="1"/>
+              <w:right w:val="single" w:color="B7C5D4" w:sz="1"/>
+            </w:tcBorders>
+            <w:shd w:fill="FFFFFF" w:val="clear"/>
+            <w:tcMar>
+              <w:top w:type="dxa" w:w="60"/>
+              <w:left w:type="dxa" w:w="120"/>
+              <w:bottom w:type="dxa" w:w="60"/>
+              <w:right w:type="dxa" w:w="120"/>
+            </w:tcMar>
+            <w:vAlign w:val="center"/>
+          </w:tcPr>
+          <w:p>
+            <w:pPr>
+              <w:spacing w:line="264"/>
+            </w:pPr>
+            <w:r>
+              <w:rPr>
+                <w:b/>
+                <w:bCs/>
+                <w:sz w:val="20"/>
+                <w:szCs w:val="20"/>
+              </w:rPr>
+              <w:t xml:space="preserve">Version</w:t>
+            </w:r>
+          </w:p>
+        </w:tc>
+        <w:tc>
+          <w:tcPr>
+            <w:tcW w:type="dxa" w:w="6760"/>
+            <w:tcBorders>
+              <w:top w:val="single" w:color="B7C5D4" w:sz="1"/>
+              <w:left w:val="single" w:color="B7C5D4" w:sz="1"/>
+              <w:bottom w:val="single" w:color="B7C5D4" w:sz="1"/>
+              <w:right w:val="single" w:color="B7C5D4" w:sz="1"/>
+            </w:tcBorders>
+            <w:shd w:fill="FFFFFF" w:val="clear"/>
+            <w:tcMar>
+              <w:top w:type="dxa" w:w="60"/>
+              <w:left w:type="dxa" w:w="120"/>
+              <w:bottom w:type="dxa" w:w="60"/>
+              <w:right w:type="dxa" w:w="120"/>
+            </w:tcMar>
+            <w:vAlign w:val="center"/>
+          </w:tcPr>
+          <w:p>
+            <w:pPr>
+              <w:spacing w:line="264"/>
+            </w:pPr>
+            <w:r>
+              <w:rPr>
+                <w:sz w:val="20"/>
+                <w:szCs w:val="20"/>
+              </w:rPr>
+              <w:t xml:space="preserve">1.0</w:t>
+            </w:r>
+          </w:p>
+        </w:tc>
+      </w:tr>
+      <w:tr>
+        <w:tc>
+          <w:tcPr>
+            <w:tcW w:type="dxa" w:w="2600"/>
+            <w:tcBorders>
+              <w:top w:val="single" w:color="B7C5D4" w:sz="1"/>
+              <w:left w:val="single" w:color="B7C5D4" w:sz="1"/>
+              <w:bottom w:val="single" w:color="B7C5D4" w:sz="1"/>
+              <w:right w:val="single" w:color="B7C5D4" w:sz="1"/>
+            </w:tcBorders>
+            <w:shd w:fill="FFFFFF" w:val="clear"/>
+            <w:tcMar>
+              <w:top w:type="dxa" w:w="60"/>
+              <w:left w:type="dxa" w:w="120"/>
+              <w:bottom w:type="dxa" w:w="60"/>
+              <w:right w:type="dxa" w:w="120"/>
+            </w:tcMar>
+            <w:vAlign w:val="center"/>
+          </w:tcPr>
+          <w:p>
+            <w:pPr>
+              <w:spacing w:line="264"/>
+            </w:pPr>
+            <w:r>
+              <w:rPr>
+                <w:b/>
+                <w:bCs/>
+                <w:sz w:val="20"/>
+                <w:szCs w:val="20"/>
+              </w:rPr>
+              <w:t xml:space="preserve">Status</w:t>
+            </w:r>
+          </w:p>
+        </w:tc>
+        <w:tc>
+          <w:tcPr>
+            <w:tcW w:type="dxa" w:w="6760"/>
+            <w:tcBorders>
+              <w:top w:val="single" w:color="B7C5D4" w:sz="1"/>
+              <w:left w:val="single" w:color="B7C5D4" w:sz="1"/>
+              <w:bottom w:val="single" w:color="B7C5D4" w:sz="1"/>
+              <w:right w:val="single" w:color="B7C5D4" w:sz="1"/>
+            </w:tcBorders>
+            <w:shd w:fill="FFFFFF" w:val="clear"/>
+            <w:tcMar>
+              <w:top w:type="dxa" w:w="60"/>
+              <w:left w:type="dxa" w:w="120"/>
+              <w:bottom w:type="dxa" w:w="60"/>
+              <w:right w:type="dxa" w:w="120"/>
+            </w:tcMar>
+            <w:vAlign w:val="center"/>
+          </w:tcPr>
+          <w:p>
+            <w:pPr>
+              <w:spacing w:line="264"/>
+            </w:pPr>
+            <w:r>
+              <w:rPr>
+                <w:sz w:val="20"/>
+                <w:szCs w:val="20"/>
+              </w:rPr>
+              <w:t xml:space="preserve">Approved</w:t>
+            </w:r>
+          </w:p>
+        </w:tc>
+      </w:tr>
+      <w:tr>
+        <w:tc>
+          <w:tcPr>
+            <w:tcW w:type="dxa" w:w="2600"/>
+            <w:tcBorders>
+              <w:top w:val="single" w:color="B7C5D4" w:sz="1"/>
+              <w:left w:val="single" w:color="B7C5D4" w:sz="1"/>
+              <w:bottom w:val="single" w:color="B7C5D4" w:sz="1"/>
+              <w:right w:val="single" w:color="B7C5D4" w:sz="1"/>
+            </w:tcBorders>
+            <w:shd w:fill="FFFFFF" w:val="clear"/>
+            <w:tcMar>
+              <w:top w:type="dxa" w:w="60"/>
+              <w:left w:type="dxa" w:w="120"/>
+              <w:bottom w:type="dxa" w:w="60"/>
+              <w:right w:type="dxa" w:w="120"/>
+            </w:tcMar>
+            <w:vAlign w:val="center"/>
+          </w:tcPr>
+          <w:p>
+            <w:pPr>
+              <w:spacing w:line="264"/>
+            </w:pPr>
+            <w:r>
+              <w:rPr>
+                <w:b/>
+                <w:bCs/>
+                <w:sz w:val="20"/>
+                <w:szCs w:val="20"/>
+              </w:rPr>
+              <w:t xml:space="preserve">Date issued</w:t>
+            </w:r>
+          </w:p>
+        </w:tc>
+        <w:tc>
+          <w:tcPr>
+            <w:tcW w:type="dxa" w:w="6760"/>
+            <w:tcBorders>
+              <w:top w:val="single" w:color="B7C5D4" w:sz="1"/>
+              <w:left w:val="single" w:color="B7C5D4" w:sz="1"/>
+              <w:bottom w:val="single" w:color="B7C5D4" w:sz="1"/>
+              <w:right w:val="single" w:color="B7C5D4" w:sz="1"/>
+            </w:tcBorders>
+            <w:shd w:fill="FFFFFF" w:val="clear"/>
+            <w:tcMar>
+              <w:top w:type="dxa" w:w="60"/>
+              <w:left w:type="dxa" w:w="120"/>
+              <w:bottom w:type="dxa" w:w="60"/>
+              <w:right w:type="dxa" w:w="120"/>
+            </w:tcMar>
+            <w:vAlign w:val="center"/>
+          </w:tcPr>
+          <w:p>
+            <w:pPr>
+              <w:spacing w:line="264"/>
+            </w:pPr>
+            <w:r>
+              <w:rPr>
+                <w:sz w:val="20"/>
+                <w:szCs w:val="20"/>
+              </w:rPr>
+              <w:t xml:space="preserve">26 July 2026</w:t>
+            </w:r>
+          </w:p>
+        </w:tc>
+      </w:tr>
+      <w:tr>
+        <w:tc>
+          <w:tcPr>
+            <w:tcW w:type="dxa" w:w="2600"/>
+            <w:tcBorders>
+              <w:top w:val="single" w:color="B7C5D4" w:sz="1"/>
+              <w:left w:val="single" w:color="B7C5D4" w:sz="1"/>
+              <w:bottom w:val="single" w:color="B7C5D4" w:sz="1"/>
+              <w:right w:val="single" w:color="B7C5D4" w:sz="1"/>
+            </w:tcBorders>
+            <w:shd w:fill="FFFFFF" w:val="clear"/>
+            <w:tcMar>
+              <w:top w:type="dxa" w:w="60"/>
+              <w:left w:type="dxa" w:w="120"/>
+              <w:bottom w:type="dxa" w:w="60"/>
+              <w:right w:type="dxa" w:w="120"/>
+            </w:tcMar>
+            <w:vAlign w:val="center"/>
+          </w:tcPr>
+          <w:p>
+            <w:pPr>
+              <w:spacing w:line="264"/>
+            </w:pPr>
+            <w:r>
+              <w:rPr>
+                <w:b/>
+                <w:bCs/>
+                <w:sz w:val="20"/>
+                <w:szCs w:val="20"/>
+              </w:rPr>
+              <w:t xml:space="preserve">Last reviewed</w:t>
+            </w:r>
+          </w:p>
+        </w:tc>
+        <w:tc>
+          <w:tcPr>
+            <w:tcW w:type="dxa" w:w="6760"/>
+            <w:tcBorders>
+              <w:top w:val="single" w:color="B7C5D4" w:sz="1"/>
+              <w:left w:val="single" w:color="B7C5D4" w:sz="1"/>
+              <w:bottom w:val="single" w:color="B7C5D4" w:sz="1"/>
+              <w:right w:val="single" w:color="B7C5D4" w:sz="1"/>
+            </w:tcBorders>
+            <w:shd w:fill="FFFFFF" w:val="clear"/>
+            <w:tcMar>
+              <w:top w:type="dxa" w:w="60"/>
+              <w:left w:type="dxa" w:w="120"/>
+              <w:bottom w:type="dxa" w:w="60"/>
+              <w:right w:type="dxa" w:w="120"/>
+            </w:tcMar>
+            <w:vAlign w:val="center"/>
+          </w:tcPr>
+          <w:p>
+            <w:pPr>
+              <w:spacing w:line="264"/>
+            </w:pPr>
+            <w:r>
+              <w:rPr>
+                <w:sz w:val="20"/>
+                <w:szCs w:val="20"/>
+              </w:rPr>
+              <w:t xml:space="preserve">26 July 2026</w:t>
+            </w:r>
+          </w:p>
+        </w:tc>
+      </w:tr>
+      <w:tr>
+        <w:tc>
+          <w:tcPr>
+            <w:tcW w:type="dxa" w:w="2600"/>
+            <w:tcBorders>
+              <w:top w:val="single" w:color="B7C5D4" w:sz="1"/>
+              <w:left w:val="single" w:color="B7C5D4" w:sz="1"/>
+              <w:bottom w:val="single" w:color="B7C5D4" w:sz="1"/>
+              <w:right w:val="single" w:color="B7C5D4" w:sz="1"/>
+            </w:tcBorders>
+            <w:shd w:fill="FFFFFF" w:val="clear"/>
+            <w:tcMar>
+              <w:top w:type="dxa" w:w="60"/>
+              <w:left w:type="dxa" w:w="120"/>
+              <w:bottom w:type="dxa" w:w="60"/>
+              <w:right w:type="dxa" w:w="120"/>
+            </w:tcMar>
+            <w:vAlign w:val="center"/>
+          </w:tcPr>
+          <w:p>
+            <w:pPr>
+              <w:spacing w:line="264"/>
+            </w:pPr>
+            <w:r>
+              <w:rPr>
+                <w:b/>
+                <w:bCs/>
+                <w:sz w:val="20"/>
+                <w:szCs w:val="20"/>
+              </w:rPr>
+              <w:t xml:space="preserve">Classification</w:t>
+            </w:r>
+          </w:p>
+        </w:tc>
+        <w:tc>
+          <w:tcPr>
+            <w:tcW w:type="dxa" w:w="6760"/>
+            <w:tcBorders>
+              <w:top w:val="single" w:color="B7C5D4" w:sz="1"/>
+              <w:left w:val="single" w:color="B7C5D4" w:sz="1"/>
+              <w:bottom w:val="single" w:color="B7C5D4" w:sz="1"/>
+              <w:right w:val="single" w:color="B7C5D4" w:sz="1"/>
+            </w:tcBorders>
+            <w:shd w:fill="FFFFFF" w:val="clear"/>
+            <w:tcMar>
+              <w:top w:type="dxa" w:w="60"/>
+              <w:left w:type="dxa" w:w="120"/>
+              <w:bottom w:type="dxa" w:w="60"/>
+              <w:right w:type="dxa" w:w="120"/>
+            </w:tcMar>
+            <w:vAlign w:val="center"/>
+          </w:tcPr>
+          <w:p>
+            <w:pPr>
+              <w:spacing w:line="264"/>
+            </w:pPr>
+            <w:r>
+              <w:rPr>
+                <w:sz w:val="20"/>
+                <w:szCs w:val="20"/>
+              </w:rPr>
+              <w:t xml:space="preserve">Internal</w:t>
+            </w:r>
+          </w:p>
+        </w:tc>
+      </w:tr>
+      <w:tr>
+        <w:tc>
+          <w:tcPr>
+            <w:tcW w:type="dxa" w:w="2600"/>
+            <w:tcBorders>
+              <w:top w:val="single" w:color="B7C5D4" w:sz="1"/>
+              <w:left w:val="single" w:color="B7C5D4" w:sz="1"/>
+              <w:bottom w:val="single" w:color="B7C5D4" w:sz="1"/>
+              <w:right w:val="single" w:color="B7C5D4" w:sz="1"/>
+            </w:tcBorders>
+            <w:shd w:fill="FFFFFF" w:val="clear"/>
+            <w:tcMar>
+              <w:top w:type="dxa" w:w="60"/>
+              <w:left w:type="dxa" w:w="120"/>
+              <w:bottom w:type="dxa" w:w="60"/>
+              <w:right w:type="dxa" w:w="120"/>
+            </w:tcMar>
+            <w:vAlign w:val="center"/>
+          </w:tcPr>
+          <w:p>
+            <w:pPr>
+              <w:spacing w:line="264"/>
+            </w:pPr>
+            <w:r>
+              <w:rPr>
+                <w:b/>
+                <w:bCs/>
+                <w:sz w:val="20"/>
+                <w:szCs w:val="20"/>
+              </w:rPr>
+              <w:t xml:space="preserve">Related documents</w:t>
+            </w:r>
+          </w:p>
+        </w:tc>
+        <w:tc>
+          <w:tcPr>
+            <w:tcW w:type="dxa" w:w="6760"/>
+            <w:tcBorders>
+              <w:top w:val="single" w:color="B7C5D4" w:sz="1"/>
+              <w:left w:val="single" w:color="B7C5D4" w:sz="1"/>
+              <w:bottom w:val="single" w:color="B7C5D4" w:sz="1"/>
+              <w:right w:val="single" w:color="B7C5D4" w:sz="1"/>
+            </w:tcBorders>
+            <w:shd w:fill="FFFFFF" w:val="clear"/>
+            <w:tcMar>
+              <w:top w:type="dxa" w:w="60"/>
+              <w:left w:type="dxa" w:w="120"/>
+              <w:bottom w:type="dxa" w:w="60"/>
+              <w:right w:type="dxa" w:w="120"/>
+            </w:tcMar>
+            <w:vAlign w:val="center"/>
+          </w:tcPr>
+          <w:p>
+            <w:pPr>
+              <w:spacing w:line="264"/>
+            </w:pPr>
+            <w:r>
+              <w:rPr>
+                <w:sz w:val="20"/>
+                <w:szCs w:val="20"/>
+              </w:rPr>
+              <w:t xml:space="preserve">SharePoint Setup Guide; project README</w:t>
+            </w:r>
+          </w:p>
+        </w:tc>
+      </w:tr>
+    </w:tbl>
+    <w:p>
+      <w:pPr>
+        <w:spacing w:before="160" w:after="60"/>
+      </w:pPr>
+      <w:r>
+        <w:rPr>
+          <w:b/>
+          <w:bCs/>
+        </w:rPr>
+        <w:t xml:space="preserve">Revision history</w:t>
+      </w:r>
+    </w:p>
+    <w:tbl>
+      <w:tblPr>
+        <w:tblW w:type="dxa" w:w="9360"/>
+        <w:tblBorders>
+          <w:top w:val="single" w:color="auto" w:sz="4"/>
+          <w:left w:val="single" w:color="auto" w:sz="4"/>
+          <w:bottom w:val="single" w:color="auto" w:sz="4"/>
+          <w:right w:val="single" w:color="auto" w:sz="4"/>
+          <w:insideH w:val="single" w:color="auto" w:sz="4"/>
+          <w:insideV w:val="single" w:color="auto" w:sz="4"/>
+        </w:tblBorders>
+      </w:tblPr>
+      <w:tblGrid>
+        <w:gridCol w:w="1200"/>
+        <w:gridCol w:w="1400"/>
+        <w:gridCol w:w="2360"/>
+        <w:gridCol w:w="4400"/>
+      </w:tblGrid>
+      <w:tr>
+        <w:trPr>
+          <w:tblHeader/>
+        </w:trPr>
+        <w:tc>
+          <w:tcPr>
+            <w:tcW w:type="dxa" w:w="1200"/>
+            <w:tcBorders>
+              <w:top w:val="single" w:color="B7C5D4" w:sz="1"/>
+              <w:left w:val="single" w:color="B7C5D4" w:sz="1"/>
+              <w:bottom w:val="single" w:color="B7C5D4" w:sz="1"/>
+              <w:right w:val="single" w:color="B7C5D4" w:sz="1"/>
+            </w:tcBorders>
+            <w:shd w:fill="1F4E79" w:val="clear"/>
+            <w:tcMar>
+              <w:top w:type="dxa" w:w="70"/>
+              <w:left w:type="dxa" w:w="120"/>
+              <w:bottom w:type="dxa" w:w="70"/>
+              <w:right w:type="dxa" w:w="120"/>
+            </w:tcMar>
+            <w:vAlign w:val="center"/>
+          </w:tcPr>
+          <w:p>
+            <w:r>
+              <w:rPr>
+                <w:b/>
+                <w:bCs/>
+                <w:color w:val="FFFFFF"/>
+                <w:sz w:val="20"/>
+                <w:szCs w:val="20"/>
+              </w:rPr>
+              <w:t xml:space="preserve">Version</w:t>
+            </w:r>
+          </w:p>
+        </w:tc>
+        <w:tc>
+          <w:tcPr>
+            <w:tcW w:type="dxa" w:w="1400"/>
+            <w:tcBorders>
+              <w:top w:val="single" w:color="B7C5D4" w:sz="1"/>
+              <w:left w:val="single" w:color="B7C5D4" w:sz="1"/>
+              <w:bottom w:val="single" w:color="B7C5D4" w:sz="1"/>
+              <w:right w:val="single" w:color="B7C5D4" w:sz="1"/>
+            </w:tcBorders>
+            <w:shd w:fill="1F4E79" w:val="clear"/>
+            <w:tcMar>
+              <w:top w:type="dxa" w:w="70"/>
+              <w:left w:type="dxa" w:w="120"/>
+              <w:bottom w:type="dxa" w:w="70"/>
+              <w:right w:type="dxa" w:w="120"/>
+            </w:tcMar>
+            <w:vAlign w:val="center"/>
+          </w:tcPr>
+          <w:p>
+            <w:r>
+              <w:rPr>
+                <w:b/>
+                <w:bCs/>
+                <w:color w:val="FFFFFF"/>
+                <w:sz w:val="20"/>
+                <w:szCs w:val="20"/>
+              </w:rPr>
+              <w:t xml:space="preserve">Date</w:t>
+            </w:r>
+          </w:p>
+        </w:tc>
+        <w:tc>
+          <w:tcPr>
+            <w:tcW w:type="dxa" w:w="2360"/>
+            <w:tcBorders>
+              <w:top w:val="single" w:color="B7C5D4" w:sz="1"/>
+              <w:left w:val="single" w:color="B7C5D4" w:sz="1"/>
+              <w:bottom w:val="single" w:color="B7C5D4" w:sz="1"/>
+              <w:right w:val="single" w:color="B7C5D4" w:sz="1"/>
+            </w:tcBorders>
+            <w:shd w:fill="1F4E79" w:val="clear"/>
+            <w:tcMar>
+              <w:top w:type="dxa" w:w="70"/>
+              <w:left w:type="dxa" w:w="120"/>
+              <w:bottom w:type="dxa" w:w="70"/>
+              <w:right w:type="dxa" w:w="120"/>
+            </w:tcMar>
+            <w:vAlign w:val="center"/>
+          </w:tcPr>
+          <w:p>
+            <w:r>
+              <w:rPr>
+                <w:b/>
+                <w:bCs/>
+                <w:color w:val="FFFFFF"/>
+                <w:sz w:val="20"/>
+                <w:szCs w:val="20"/>
+              </w:rPr>
+              <w:t xml:space="preserve">Author</w:t>
+            </w:r>
+          </w:p>
+        </w:tc>
+        <w:tc>
+          <w:tcPr>
+            <w:tcW w:type="dxa" w:w="4400"/>
+            <w:tcBorders>
+              <w:top w:val="single" w:color="B7C5D4" w:sz="1"/>
+              <w:left w:val="single" w:color="B7C5D4" w:sz="1"/>
+              <w:bottom w:val="single" w:color="B7C5D4" w:sz="1"/>
+              <w:right w:val="single" w:color="B7C5D4" w:sz="1"/>
+            </w:tcBorders>
+            <w:shd w:fill="1F4E79" w:val="clear"/>
+            <w:tcMar>
+              <w:top w:type="dxa" w:w="70"/>
+              <w:left w:type="dxa" w:w="120"/>
+              <w:bottom w:type="dxa" w:w="70"/>
+              <w:right w:type="dxa" w:w="120"/>
+            </w:tcMar>
+            <w:vAlign w:val="center"/>
+          </w:tcPr>
+          <w:p>
+            <w:r>
+              <w:rPr>
+                <w:b/>
+                <w:bCs/>
+                <w:color w:val="FFFFFF"/>
+                <w:sz w:val="20"/>
+                <w:szCs w:val="20"/>
+              </w:rPr>
+              <w:t xml:space="preserve">Summary of changes</w:t>
+            </w:r>
+          </w:p>
+        </w:tc>
+      </w:tr>
+      <w:tr>
+        <w:tc>
+          <w:tcPr>
+            <w:tcW w:type="dxa" w:w="1200"/>
+            <w:tcBorders>
+              <w:top w:val="single" w:color="B7C5D4" w:sz="1"/>
+              <w:left w:val="single" w:color="B7C5D4" w:sz="1"/>
+              <w:bottom w:val="single" w:color="B7C5D4" w:sz="1"/>
+              <w:right w:val="single" w:color="B7C5D4" w:sz="1"/>
+            </w:tcBorders>
+            <w:shd w:fill="FFFFFF" w:val="clear"/>
+            <w:tcMar>
+              <w:top w:type="dxa" w:w="60"/>
+              <w:left w:type="dxa" w:w="120"/>
+              <w:bottom w:type="dxa" w:w="60"/>
+              <w:right w:type="dxa" w:w="120"/>
+            </w:tcMar>
+            <w:vAlign w:val="center"/>
+          </w:tcPr>
+          <w:p>
+            <w:pPr>
+              <w:spacing w:line="264"/>
+            </w:pPr>
+            <w:r>
+              <w:rPr>
+                <w:sz w:val="20"/>
+                <w:szCs w:val="20"/>
+              </w:rPr>
+              <w:t xml:space="preserve">1.0</w:t>
+            </w:r>
+          </w:p>
+        </w:tc>
+        <w:tc>
+          <w:tcPr>
+            <w:tcW w:type="dxa" w:w="1400"/>
+            <w:tcBorders>
+              <w:top w:val="single" w:color="B7C5D4" w:sz="1"/>
+              <w:left w:val="single" w:color="B7C5D4" w:sz="1"/>
+              <w:bottom w:val="single" w:color="B7C5D4" w:sz="1"/>
+              <w:right w:val="single" w:color="B7C5D4" w:sz="1"/>
+            </w:tcBorders>
+            <w:shd w:fill="FFFFFF" w:val="clear"/>
+            <w:tcMar>
+              <w:top w:type="dxa" w:w="60"/>
+              <w:left w:type="dxa" w:w="120"/>
+              <w:bottom w:type="dxa" w:w="60"/>
+              <w:right w:type="dxa" w:w="120"/>
+            </w:tcMar>
+            <w:vAlign w:val="center"/>
+          </w:tcPr>
+          <w:p>
+            <w:pPr>
+              <w:spacing w:line="264"/>
+            </w:pPr>
+            <w:r>
+              <w:rPr>
+                <w:sz w:val="20"/>
+                <w:szCs w:val="20"/>
+              </w:rPr>
+              <w:t xml:space="preserve">26 Jul 2026</w:t>
+            </w:r>
+          </w:p>
+        </w:tc>
+        <w:tc>
+          <w:tcPr>
+            <w:tcW w:type="dxa" w:w="2360"/>
+            <w:tcBorders>
+              <w:top w:val="single" w:color="B7C5D4" w:sz="1"/>
+              <w:left w:val="single" w:color="B7C5D4" w:sz="1"/>
+              <w:bottom w:val="single" w:color="B7C5D4" w:sz="1"/>
+              <w:right w:val="single" w:color="B7C5D4" w:sz="1"/>
+            </w:tcBorders>
+            <w:shd w:fill="FFFFFF" w:val="clear"/>
+            <w:tcMar>
+              <w:top w:type="dxa" w:w="60"/>
+              <w:left w:type="dxa" w:w="120"/>
+              <w:bottom w:type="dxa" w:w="60"/>
+              <w:right w:type="dxa" w:w="120"/>
+            </w:tcMar>
+            <w:vAlign w:val="center"/>
+          </w:tcPr>
+          <w:p>
+            <w:pPr>
+              <w:spacing w:line="264"/>
+            </w:pPr>
+            <w:r>
+              <w:rPr>
+                <w:sz w:val="20"/>
+                <w:szCs w:val="20"/>
+              </w:rPr>
+              <w:t xml:space="preserve">Kenneth Cruickshank</w:t>
+            </w:r>
+          </w:p>
+        </w:tc>
+        <w:tc>
+          <w:tcPr>
+            <w:tcW w:type="dxa" w:w="4400"/>
+            <w:tcBorders>
+              <w:top w:val="single" w:color="B7C5D4" w:sz="1"/>
+              <w:left w:val="single" w:color="B7C5D4" w:sz="1"/>
+              <w:bottom w:val="single" w:color="B7C5D4" w:sz="1"/>
+              <w:right w:val="single" w:color="B7C5D4" w:sz="1"/>
+            </w:tcBorders>
+            <w:shd w:fill="FFFFFF" w:val="clear"/>
+            <w:tcMar>
+              <w:top w:type="dxa" w:w="60"/>
+              <w:left w:type="dxa" w:w="120"/>
+              <w:bottom w:type="dxa" w:w="60"/>
+              <w:right w:type="dxa" w:w="120"/>
+            </w:tcMar>
+            <w:vAlign w:val="center"/>
+          </w:tcPr>
+          <w:p>
+            <w:pPr>
+              <w:spacing w:line="264"/>
+            </w:pPr>
+            <w:r>
+              <w:rPr>
+                <w:sz w:val="20"/>
+                <w:szCs w:val="20"/>
+              </w:rPr>
+              <w:t xml:space="preserve">Initial release of the user guide.</w:t>
+            </w:r>
+          </w:p>
+        </w:tc>
+      </w:tr>
+    </w:tbl>
     <w:p>
       <w:r>
         <w:br w:type="page"/>

</xml_diff>